<commit_message>
deleted other repo folder
</commit_message>
<xml_diff>
--- a/dev1virtuoso/Attachment/dev1virtuoso/resume/V2/Color block resume.docx
+++ b/dev1virtuoso/Attachment/dev1virtuoso/resume/V2/Color block resume.docx
@@ -566,19 +566,9 @@
             <w:pPr>
               <w:pStyle w:val="Heading4"/>
             </w:pPr>
-            <w:proofErr w:type="spellStart"/>
             <w:r>
-              <w:t>Sodtware</w:t>
+              <w:t>Sodtware Devloper</w:t>
             </w:r>
-            <w:proofErr w:type="spellEnd"/>
-            <w:r>
-              <w:t xml:space="preserve"> </w:t>
-            </w:r>
-            <w:proofErr w:type="spellStart"/>
-            <w:r>
-              <w:t>Devloper</w:t>
-            </w:r>
-            <w:proofErr w:type="spellEnd"/>
           </w:p>
         </w:tc>
       </w:tr>
@@ -1302,28 +1292,12 @@
                 <w:szCs w:val="28"/>
               </w:rPr>
             </w:pPr>
-            <w:sdt>
-              <w:sdtPr>
-                <w:rPr>
-                  <w:szCs w:val="28"/>
-                </w:rPr>
-                <w:id w:val="-495339227"/>
-                <w:placeholder>
-                  <w:docPart w:val="33044AD48E4E41E1A21E01E512E7FA72"/>
-                </w:placeholder>
-                <w:temporary/>
-                <w:showingPlcHdr/>
-                <w15:appearance w15:val="hidden"/>
-              </w:sdtPr>
-              <w:sdtContent>
-                <w:r>
-                  <w:rPr>
-                    <w:szCs w:val="28"/>
-                  </w:rPr>
-                  <w:t>UI/UX design</w:t>
-                </w:r>
-              </w:sdtContent>
-            </w:sdt>
+            <w:r>
+              <w:rPr>
+                <w:szCs w:val="28"/>
+              </w:rPr>
+              <w:t>UI/UX Design</w:t>
+            </w:r>
           </w:p>
           <w:p>
             <w:pPr>
@@ -1336,16 +1310,20 @@
               <w:rPr>
                 <w:szCs w:val="28"/>
               </w:rPr>
-              <w:t xml:space="preserve">App </w:t>
+              <w:t>App Desi</w:t>
             </w:r>
-            <w:proofErr w:type="spellStart"/>
             <w:r>
               <w:rPr>
                 <w:szCs w:val="28"/>
               </w:rPr>
-              <w:t>Desinn</w:t>
+              <w:t>g</w:t>
             </w:r>
-            <w:proofErr w:type="spellEnd"/>
+            <w:r>
+              <w:rPr>
+                <w:szCs w:val="28"/>
+              </w:rPr>
+              <w:t>n</w:t>
+            </w:r>
           </w:p>
           <w:p>
             <w:pPr>
@@ -3276,35 +3254,6 @@
     </w:docPart>
     <w:docPart>
       <w:docPartPr>
-        <w:name w:val="33044AD48E4E41E1A21E01E512E7FA72"/>
-        <w:category>
-          <w:name w:val="General"/>
-          <w:gallery w:val="placeholder"/>
-        </w:category>
-        <w:types>
-          <w:type w:val="bbPlcHdr"/>
-        </w:types>
-        <w:behaviors>
-          <w:behavior w:val="content"/>
-        </w:behaviors>
-        <w:guid w:val="{D6C3D272-E3CE-47D1-8110-A1958F0F5715}"/>
-      </w:docPartPr>
-      <w:docPartBody>
-        <w:p>
-          <w:pPr>
-            <w:pStyle w:val="33044AD48E4E41E1A21E01E512E7FA723"/>
-          </w:pPr>
-          <w:r>
-            <w:rPr>
-              <w:szCs w:val="28"/>
-            </w:rPr>
-            <w:t>UI/UX design</w:t>
-          </w:r>
-        </w:p>
-      </w:docPartBody>
-    </w:docPart>
-    <w:docPart>
-      <w:docPartPr>
         <w:name w:val="766AE9B9C6074F5DB15B82178F899F57"/>
         <w:category>
           <w:name w:val="General"/>
@@ -3409,6 +3358,14 @@
     <w:pitch w:val="variable"/>
     <w:sig w:usb0="00000007" w:usb1="00000000" w:usb2="00000000" w:usb3="00000000" w:csb0="00000003" w:csb1="00000000"/>
   </w:font>
+  <w:font w:name="Dotum">
+    <w:altName w:val="돋움"/>
+    <w:panose1 w:val="020B0600000101010101"/>
+    <w:charset w:val="81"/>
+    <w:family w:val="modern"/>
+    <w:pitch w:val="fixed"/>
+    <w:sig w:usb0="00000001" w:usb1="09060000" w:usb2="00000010" w:usb3="00000000" w:csb0="00080000" w:csb1="00000000"/>
+  </w:font>
   <w:font w:name="Segoe UI">
     <w:panose1 w:val="020B0502040204020203"/>
     <w:charset w:val="00"/>
@@ -3416,19 +3373,34 @@
     <w:pitch w:val="variable"/>
     <w:sig w:usb0="E4002EFF" w:usb1="C000E47F" w:usb2="00000009" w:usb3="00000000" w:csb0="000001FF" w:csb1="00000000"/>
   </w:font>
-  <w:font w:name="Calibri">
-    <w:panose1 w:val="020F0502020204030204"/>
+  <w:font w:name="Batang">
+    <w:altName w:val="바탕"/>
+    <w:panose1 w:val="02030600000101010101"/>
+    <w:charset w:val="81"/>
+    <w:family w:val="auto"/>
+    <w:pitch w:val="fixed"/>
+    <w:sig w:usb0="00000001" w:usb1="09060000" w:usb2="00000010" w:usb3="00000000" w:csb0="00080000" w:csb1="00000000"/>
+  </w:font>
+  <w:font w:name="Aptos">
+    <w:panose1 w:val="020B0004020202020204"/>
     <w:charset w:val="00"/>
-    <w:family w:val="modern"/>
+    <w:family w:val="swiss"/>
     <w:pitch w:val="variable"/>
-    <w:sig w:usb0="00000003" w:usb1="00000000" w:usb2="00000000" w:usb3="00000000" w:csb0="00000001" w:csb1="00000000"/>
+    <w:sig w:usb0="20000287" w:usb1="00000003" w:usb2="00000000" w:usb3="00000000" w:csb0="0000019F" w:csb1="00000000"/>
   </w:font>
-  <w:font w:name="Calibri Light">
-    <w:panose1 w:val="020F0302020204030204"/>
+  <w:font w:name="Malgun Gothic">
+    <w:altName w:val="맑은 고딕"/>
+    <w:panose1 w:val="020B0503020000020004"/>
+    <w:charset w:val="81"/>
+    <w:family w:val="roman"/>
+    <w:pitch w:val="default"/>
+  </w:font>
+  <w:font w:name="Aptos Display">
+    <w:panose1 w:val="020B0004020202020204"/>
     <w:charset w:val="00"/>
-    <w:family w:val="modern"/>
+    <w:family w:val="swiss"/>
     <w:pitch w:val="variable"/>
-    <w:sig w:usb0="00000003" w:usb1="00000000" w:usb2="00000000" w:usb3="00000000" w:csb0="00000001" w:csb1="00000000"/>
+    <w:sig w:usb0="20000287" w:usb1="00000003" w:usb2="00000000" w:usb3="00000000" w:csb0="0000019F" w:csb1="00000000"/>
   </w:font>
 </w:fonts>
 </file>
@@ -3564,7 +3536,7 @@
       </w:pPr>
       <w:rPr>
         <w:rFonts w:ascii="Symbol" w:hAnsi="Symbol" w:hint="default"/>
-        <w:color w:val="E7E6E6" w:themeColor="background2"/>
+        <w:color w:val="E8E8E8" w:themeColor="background2"/>
       </w:rPr>
     </w:lvl>
     <w:lvl w:ilvl="1">
@@ -3940,6 +3912,7 @@
     <w:rsid w:val="00195A6E"/>
     <w:rsid w:val="001D362F"/>
     <w:rsid w:val="00291798"/>
+    <w:rsid w:val="002A2127"/>
     <w:rsid w:val="004A37B2"/>
     <w:rsid w:val="0056011A"/>
     <w:rsid w:val="005A370A"/>
@@ -3954,6 +3927,7 @@
     <w:rsid w:val="00B23670"/>
     <w:rsid w:val="00C5139C"/>
     <w:rsid w:val="00C852CD"/>
+    <w:rsid w:val="00C944DD"/>
     <w:rsid w:val="00CE0AB1"/>
     <w:rsid w:val="00CF07D0"/>
     <w:rsid w:val="00DF4FE9"/>
@@ -3975,7 +3949,7 @@
     <m:intLim m:val="subSup"/>
     <m:naryLim m:val="undOvr"/>
   </m:mathPr>
-  <w:themeFontLang w:val="en-US"/>
+  <w:themeFontLang w:val="en-US" w:eastAsia="ko-KR"/>
   <w:clrSchemeMapping w:bg1="light1" w:t1="dark1" w:bg2="light2" w:t2="dark2" w:accent1="accent1" w:accent2="accent2" w:accent3="accent3" w:accent4="accent4" w:accent5="accent5" w:accent6="accent6" w:hyperlink="hyperlink" w:followedHyperlink="followedHyperlink"/>
   <w:decimalSymbol w:val="."/>
   <w:listSeparator w:val=","/>
@@ -4429,7 +4403,7 @@
       <w:rFonts w:eastAsiaTheme="majorEastAsia" w:cstheme="majorBidi"/>
       <w:b/>
       <w:iCs/>
-      <w:color w:val="5B9BD5" w:themeColor="accent5"/>
+      <w:color w:val="A02B93" w:themeColor="accent5"/>
       <w:sz w:val="28"/>
       <w:szCs w:val="18"/>
     </w:rPr>
@@ -4481,7 +4455,7 @@
       <w:rFonts w:eastAsiaTheme="majorEastAsia" w:cstheme="majorBidi"/>
       <w:b/>
       <w:iCs/>
-      <w:color w:val="5B9BD5" w:themeColor="accent5"/>
+      <w:color w:val="A02B93" w:themeColor="accent5"/>
       <w:sz w:val="28"/>
       <w:szCs w:val="18"/>
     </w:rPr>
@@ -4501,7 +4475,7 @@
     </w:pPr>
     <w:rPr>
       <w:rFonts w:eastAsiaTheme="minorHAnsi" w:cstheme="minorBidi"/>
-      <w:color w:val="4472C4" w:themeColor="accent1"/>
+      <w:color w:val="156082" w:themeColor="accent1"/>
       <w:sz w:val="28"/>
       <w:szCs w:val="18"/>
     </w:rPr>
@@ -4533,7 +4507,7 @@
     </w:pPr>
     <w:rPr>
       <w:rFonts w:eastAsiaTheme="minorHAnsi" w:cstheme="minorBidi"/>
-      <w:color w:val="44546A" w:themeColor="text2"/>
+      <w:color w:val="0E2841" w:themeColor="text2"/>
       <w:sz w:val="18"/>
       <w:szCs w:val="18"/>
     </w:rPr>
@@ -4555,7 +4529,7 @@
     </w:pPr>
     <w:rPr>
       <w:rFonts w:eastAsiaTheme="minorHAnsi" w:cstheme="minorBidi"/>
-      <w:color w:val="44546A" w:themeColor="text2"/>
+      <w:color w:val="0E2841" w:themeColor="text2"/>
       <w:sz w:val="18"/>
       <w:szCs w:val="18"/>
     </w:rPr>
@@ -4577,7 +4551,7 @@
     </w:pPr>
     <w:rPr>
       <w:rFonts w:eastAsiaTheme="minorHAnsi" w:cstheme="minorBidi"/>
-      <w:color w:val="44546A" w:themeColor="text2"/>
+      <w:color w:val="0E2841" w:themeColor="text2"/>
       <w:sz w:val="18"/>
       <w:szCs w:val="18"/>
     </w:rPr>
@@ -4599,7 +4573,7 @@
     </w:pPr>
     <w:rPr>
       <w:rFonts w:eastAsiaTheme="minorHAnsi" w:cstheme="minorBidi"/>
-      <w:color w:val="44546A" w:themeColor="text2"/>
+      <w:color w:val="0E2841" w:themeColor="text2"/>
       <w:sz w:val="18"/>
       <w:szCs w:val="18"/>
     </w:rPr>
@@ -4618,7 +4592,7 @@
     <w:rPr>
       <w:rFonts w:eastAsiaTheme="minorHAnsi" w:cstheme="minorBidi"/>
       <w:caps/>
-      <w:color w:val="4472C4" w:themeColor="accent1"/>
+      <w:color w:val="156082" w:themeColor="accent1"/>
       <w:sz w:val="18"/>
       <w:szCs w:val="18"/>
     </w:rPr>
@@ -4632,7 +4606,7 @@
     <w:rPr>
       <w:rFonts w:eastAsiaTheme="minorHAnsi"/>
       <w:caps/>
-      <w:color w:val="4472C4" w:themeColor="accent1"/>
+      <w:color w:val="156082" w:themeColor="accent1"/>
       <w:sz w:val="18"/>
       <w:szCs w:val="18"/>
     </w:rPr>
@@ -4666,34 +4640,6 @@
   </w:style>
   <w:style w:type="paragraph" w:customStyle="1" w:styleId="C3450B2B276B44D291422A2186711C44">
     <w:name w:val="C3450B2B276B44D291422A2186711C44"/>
-    <w:rsid w:val="005C1634"/>
-    <w:rPr>
-      <w:lang w:val="en-AU" w:eastAsia="en-AU"/>
-    </w:rPr>
-  </w:style>
-  <w:style w:type="paragraph" w:customStyle="1" w:styleId="912B4564C7E04FD48F5468975598D1F2">
-    <w:name w:val="912B4564C7E04FD48F5468975598D1F2"/>
-    <w:rsid w:val="005C1634"/>
-    <w:rPr>
-      <w:lang w:val="en-AU" w:eastAsia="en-AU"/>
-    </w:rPr>
-  </w:style>
-  <w:style w:type="paragraph" w:customStyle="1" w:styleId="525DE04D86C04F899AB7622CEC073679">
-    <w:name w:val="525DE04D86C04F899AB7622CEC073679"/>
-    <w:rsid w:val="005C1634"/>
-    <w:rPr>
-      <w:lang w:val="en-AU" w:eastAsia="en-AU"/>
-    </w:rPr>
-  </w:style>
-  <w:style w:type="paragraph" w:customStyle="1" w:styleId="4D0A650290AD4BADA2CBC824F622D3BF">
-    <w:name w:val="4D0A650290AD4BADA2CBC824F622D3BF"/>
-    <w:rsid w:val="005C1634"/>
-    <w:rPr>
-      <w:lang w:val="en-AU" w:eastAsia="en-AU"/>
-    </w:rPr>
-  </w:style>
-  <w:style w:type="paragraph" w:customStyle="1" w:styleId="4F35B477AE8442C9BC8E4FCF1E79F1D9">
-    <w:name w:val="4F35B477AE8442C9BC8E4FCF1E79F1D9"/>
     <w:rsid w:val="005C1634"/>
     <w:rPr>
       <w:lang w:val="en-AU" w:eastAsia="en-AU"/>
@@ -4726,7 +4672,7 @@
     </w:pPr>
     <w:rPr>
       <w:rFonts w:eastAsiaTheme="minorHAnsi"/>
-      <w:color w:val="4472C4" w:themeColor="accent1"/>
+      <w:color w:val="156082" w:themeColor="accent1"/>
       <w:sz w:val="28"/>
       <w:szCs w:val="18"/>
     </w:rPr>
@@ -4744,7 +4690,7 @@
     </w:pPr>
     <w:rPr>
       <w:rFonts w:eastAsiaTheme="minorHAnsi"/>
-      <w:color w:val="4472C4" w:themeColor="accent1"/>
+      <w:color w:val="156082" w:themeColor="accent1"/>
       <w:sz w:val="28"/>
       <w:szCs w:val="18"/>
     </w:rPr>
@@ -4762,7 +4708,7 @@
     </w:pPr>
     <w:rPr>
       <w:rFonts w:eastAsiaTheme="minorHAnsi"/>
-      <w:color w:val="4472C4" w:themeColor="accent1"/>
+      <w:color w:val="156082" w:themeColor="accent1"/>
       <w:sz w:val="28"/>
       <w:szCs w:val="18"/>
     </w:rPr>
@@ -4979,6 +4925,15 @@
 </file>
 
 <file path=customXml/item1.xml><?xml version="1.0" encoding="utf-8"?>
+<?mso-contentType ?>
+<FormTemplates xmlns="http://schemas.microsoft.com/sharepoint/v3/contenttype/forms">
+  <Display>DocumentLibraryForm</Display>
+  <Edit>DocumentLibraryForm</Edit>
+  <New>DocumentLibraryForm</New>
+</FormTemplates>
+</file>
+
+<file path=customXml/item2.xml><?xml version="1.0" encoding="utf-8"?>
 <ct:contentTypeSchema xmlns:ct="http://schemas.microsoft.com/office/2006/metadata/contentType" xmlns:ma="http://schemas.microsoft.com/office/2006/metadata/properties/metaAttributes" ct:_="" ma:_="" ma:contentTypeName="Document" ma:contentTypeID="0x01010079F111ED35F8CC479449609E8A0923A6" ma:contentTypeVersion="28" ma:contentTypeDescription="Create a new document." ma:contentTypeScope="" ma:versionID="60f5a4f2d2b0abadcf532d48ebf9cb71">
   <xsd:schema xmlns:xsd="http://www.w3.org/2001/XMLSchema" xmlns:xs="http://www.w3.org/2001/XMLSchema" xmlns:p="http://schemas.microsoft.com/office/2006/metadata/properties" xmlns:ns1="http://schemas.microsoft.com/sharepoint/v3" xmlns:ns2="71af3243-3dd4-4a8d-8c0d-dd76da1f02a5" xmlns:ns3="16c05727-aa75-4e4a-9b5f-8a80a1165891" xmlns:ns4="230e9df3-be65-4c73-a93b-d1236ebd677e" targetNamespace="http://schemas.microsoft.com/office/2006/metadata/properties" ma:root="true" ma:fieldsID="7dd78129e6a1811f84807ad11c651531" ns1:_="" ns2:_="" ns3:_="" ns4:_="">
     <xsd:import namespace="http://schemas.microsoft.com/sharepoint/v3"/>
@@ -5290,15 +5245,6 @@
 </ct:contentTypeSchema>
 </file>
 
-<file path=customXml/item2.xml><?xml version="1.0" encoding="utf-8"?>
-<?mso-contentType ?>
-<FormTemplates xmlns="http://schemas.microsoft.com/sharepoint/v3/contenttype/forms">
-  <Display>DocumentLibraryForm</Display>
-  <Edit>DocumentLibraryForm</Edit>
-  <New>DocumentLibraryForm</New>
-</FormTemplates>
-</file>
-
 <file path=customXml/item3.xml><?xml version="1.0" encoding="utf-8"?>
 <p:properties xmlns:p="http://schemas.microsoft.com/office/2006/metadata/properties" xmlns:xsi="http://www.w3.org/2001/XMLSchema-instance" xmlns:pc="http://schemas.microsoft.com/office/infopath/2007/PartnerControls">
   <documentManagement>
@@ -5320,6 +5266,14 @@
 </file>
 
 <file path=customXml/itemProps1.xml><?xml version="1.0" encoding="utf-8"?>
+<ds:datastoreItem xmlns:ds="http://schemas.openxmlformats.org/officeDocument/2006/customXml" ds:itemID="{C1B41FED-383C-4E81-A1BE-0F43D47BBA7D}">
+  <ds:schemaRefs>
+    <ds:schemaRef ds:uri="http://schemas.microsoft.com/sharepoint/v3/contenttype/forms"/>
+  </ds:schemaRefs>
+</ds:datastoreItem>
+</file>
+
+<file path=customXml/itemProps2.xml><?xml version="1.0" encoding="utf-8"?>
 <ds:datastoreItem xmlns:ds="http://schemas.openxmlformats.org/officeDocument/2006/customXml" ds:itemID="{724D3FBC-5C5B-4ECC-A8E7-1F8E4AE75F11}">
   <ds:schemaRefs>
     <ds:schemaRef ds:uri="http://schemas.microsoft.com/office/2006/metadata/contentType"/>
@@ -5340,14 +5294,6 @@
 </ds:datastoreItem>
 </file>
 
-<file path=customXml/itemProps2.xml><?xml version="1.0" encoding="utf-8"?>
-<ds:datastoreItem xmlns:ds="http://schemas.openxmlformats.org/officeDocument/2006/customXml" ds:itemID="{C1B41FED-383C-4E81-A1BE-0F43D47BBA7D}">
-  <ds:schemaRefs>
-    <ds:schemaRef ds:uri="http://schemas.microsoft.com/sharepoint/v3/contenttype/forms"/>
-  </ds:schemaRefs>
-</ds:datastoreItem>
-</file>
-
 <file path=customXml/itemProps3.xml><?xml version="1.0" encoding="utf-8"?>
 <ds:datastoreItem xmlns:ds="http://schemas.openxmlformats.org/officeDocument/2006/customXml" ds:itemID="{A52C9B95-23A4-4407-B754-EE703FEF6257}">
   <ds:schemaRefs>

</xml_diff>

<commit_message>
deleted pess-unify Team Integrity, fix resume typo
</commit_message>
<xml_diff>
--- a/dev1virtuoso/Attachment/dev1virtuoso/resume/V2/Color block resume.docx
+++ b/dev1virtuoso/Attachment/dev1virtuoso/resume/V2/Color block resume.docx
@@ -14,7 +14,7 @@
         <mc:AlternateContent>
           <mc:Choice Requires="wpg">
             <w:drawing>
-              <wp:anchor distT="0" distB="0" distL="114300" distR="114300" simplePos="0" relativeHeight="251659264" behindDoc="1" locked="1" layoutInCell="1" allowOverlap="1" wp14:anchorId="088F0AC5" wp14:editId="6D63FACA">
+              <wp:anchor distT="0" distB="0" distL="114300" distR="114300" simplePos="0" relativeHeight="251659264" behindDoc="1" locked="1" layoutInCell="1" allowOverlap="1" wp14:anchorId="088F0AC5" wp14:editId="00CB0C51">
                 <wp:simplePos x="0" y="0"/>
                 <wp:positionH relativeFrom="page">
                   <wp:posOffset>-10795</wp:posOffset>
@@ -435,15 +435,15 @@
           </mc:Choice>
           <mc:Fallback>
             <w:pict>
-              <v:group w14:anchorId="03080EFB" id="Group 5" o:spid="_x0000_s1026" alt="&quot;&quot;" style="position:absolute;margin-left:-.85pt;margin-top:-35.15pt;width:622.8pt;height:796.3pt;z-index:-251657216;mso-position-horizontal-relative:page;mso-width-relative:margin;mso-height-relative:margin" coordsize="79089,101102" o:gfxdata="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">
-                <v:rect id="Rectangle 114" o:spid="_x0000_s1027" alt="&quot;&quot;" style="position:absolute;left:152;top:18440;width:43251;height:82662;visibility:visible;mso-wrap-style:square;v-text-anchor:middle" o:gfxdata="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" fillcolor="white [3212]" stroked="f" strokeweight="1pt"/>
-                <v:rect id="Rectangle 107" o:spid="_x0000_s1028" alt="&quot;&quot;" style="position:absolute;left:43129;width:35960;height:20952;visibility:visible;mso-wrap-style:square;v-text-anchor:middle" o:gfxdata="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" fillcolor="#00798b [3204]" stroked="f" strokeweight="1pt"/>
-                <v:rect id="Rectangle 106" o:spid="_x0000_s1029" alt="&quot;&quot;" style="position:absolute;width:43309;height:20955;visibility:visible;mso-wrap-style:square;v-text-anchor:middle" o:gfxdata="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" fillcolor="#333 [3215]" stroked="f" strokeweight="1pt"/>
-                <v:rect id="Rectangle 108" o:spid="_x0000_s1030" alt="&quot;&quot;" style="position:absolute;top:20802;width:44507;height:5780;visibility:visible;mso-wrap-style:square;v-text-anchor:middle" o:gfxdata="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" fillcolor="#00798b [3204]" stroked="f" strokeweight="1pt"/>
-                <v:rect id="Rectangle 109" o:spid="_x0000_s1031" alt="&quot;&quot;" style="position:absolute;left:43281;top:20802;width:35778;height:5779;visibility:visible;mso-wrap-style:square;v-text-anchor:middle" o:gfxdata="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" fillcolor="#434343 [3206]" stroked="f" strokeweight="1pt"/>
-                <v:rect id="Rectangle 110" o:spid="_x0000_s1032" alt="&quot;&quot;" style="position:absolute;top:42595;width:44507;height:5760;visibility:visible;mso-wrap-style:square;v-text-anchor:middle" o:gfxdata="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" fillcolor="#00798b [3204]" stroked="f" strokeweight="1pt"/>
-                <v:rect id="Rectangle 111" o:spid="_x0000_s1033" alt="&quot;&quot;" style="position:absolute;left:43205;top:42595;width:35787;height:5760;visibility:visible;mso-wrap-style:square;v-text-anchor:middle" o:gfxdata="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" fillcolor="#434343 [3206]" stroked="f" strokeweight="1pt"/>
-                <v:rect id="Rectangle 113" o:spid="_x0000_s1034" alt="&quot;&quot;" style="position:absolute;left:43205;top:70942;width:35782;height:6139;visibility:visible;mso-wrap-style:square;v-text-anchor:middle" o:gfxdata="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" fillcolor="#434343 [3206]" stroked="f" strokeweight="1pt"/>
+              <v:group w14:anchorId="37E346BC" id="Group 5" o:spid="_x0000_s1026" alt="&quot;&quot;" style="position:absolute;margin-left:-.85pt;margin-top:-35.15pt;width:622.8pt;height:796.3pt;z-index:-251657216;mso-position-horizontal-relative:page;mso-width-relative:margin;mso-height-relative:margin" coordsize="79089,101102" o:gfxdata="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">
+                <v:rect id="Rectangle 114" o:spid="_x0000_s1027" alt="&quot;&quot;" style="position:absolute;left:152;top:18440;width:43251;height:82662;visibility:visible;mso-wrap-style:square;v-text-anchor:middle" o:gfxdata="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" fillcolor="white [3212]" stroked="f" strokeweight="1pt"/>
+                <v:rect id="Rectangle 107" o:spid="_x0000_s1028" alt="&quot;&quot;" style="position:absolute;left:43129;width:35960;height:20952;visibility:visible;mso-wrap-style:square;v-text-anchor:middle" o:gfxdata="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" fillcolor="#00798b [3204]" stroked="f" strokeweight="1pt"/>
+                <v:rect id="Rectangle 106" o:spid="_x0000_s1029" alt="&quot;&quot;" style="position:absolute;width:43309;height:20955;visibility:visible;mso-wrap-style:square;v-text-anchor:middle" o:gfxdata="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" fillcolor="#333 [3215]" stroked="f" strokeweight="1pt"/>
+                <v:rect id="Rectangle 108" o:spid="_x0000_s1030" alt="&quot;&quot;" style="position:absolute;top:20802;width:44507;height:5780;visibility:visible;mso-wrap-style:square;v-text-anchor:middle" o:gfxdata="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" fillcolor="#00798b [3204]" stroked="f" strokeweight="1pt"/>
+                <v:rect id="Rectangle 109" o:spid="_x0000_s1031" alt="&quot;&quot;" style="position:absolute;left:43281;top:20802;width:35778;height:5779;visibility:visible;mso-wrap-style:square;v-text-anchor:middle" o:gfxdata="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" fillcolor="#434343 [3206]" stroked="f" strokeweight="1pt"/>
+                <v:rect id="Rectangle 110" o:spid="_x0000_s1032" alt="&quot;&quot;" style="position:absolute;top:42595;width:44507;height:5760;visibility:visible;mso-wrap-style:square;v-text-anchor:middle" o:gfxdata="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" fillcolor="#00798b [3204]" stroked="f" strokeweight="1pt"/>
+                <v:rect id="Rectangle 111" o:spid="_x0000_s1033" alt="&quot;&quot;" style="position:absolute;left:43205;top:42595;width:35787;height:5760;visibility:visible;mso-wrap-style:square;v-text-anchor:middle" o:gfxdata="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" fillcolor="#434343 [3206]" stroked="f" strokeweight="1pt"/>
+                <v:rect id="Rectangle 113" o:spid="_x0000_s1034" alt="&quot;&quot;" style="position:absolute;left:43205;top:70942;width:35782;height:6139;visibility:visible;mso-wrap-style:square;v-text-anchor:middle" o:gfxdata="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" fillcolor="#434343 [3206]" stroked="f" strokeweight="1pt"/>
                 <w10:wrap anchorx="page"/>
                 <w10:anchorlock/>
               </v:group>
@@ -522,9 +522,6 @@
             <w:pPr>
               <w:pStyle w:val="Heading3"/>
             </w:pPr>
-            <w:r>
-              <w:t>Software Engineer</w:t>
-            </w:r>
           </w:p>
         </w:tc>
       </w:tr>
@@ -567,7 +564,7 @@
               <w:pStyle w:val="Heading4"/>
             </w:pPr>
             <w:r>
-              <w:t>Sodtware Devloper</w:t>
+              <w:t>Software Engineer</w:t>
             </w:r>
           </w:p>
         </w:tc>
@@ -609,22 +606,6 @@
             <w:pPr>
               <w:pStyle w:val="Heading5"/>
             </w:pPr>
-            <w:sdt>
-              <w:sdtPr>
-                <w:id w:val="-185993986"/>
-                <w:placeholder>
-                  <w:docPart w:val="B80428F3CBB84FF2831AB0FC3EB924F9"/>
-                </w:placeholder>
-                <w:temporary/>
-                <w:showingPlcHdr/>
-                <w15:appearance w15:val="hidden"/>
-              </w:sdtPr>
-              <w:sdtContent>
-                <w:r>
-                  <w:t>Developer</w:t>
-                </w:r>
-              </w:sdtContent>
-            </w:sdt>
           </w:p>
         </w:tc>
       </w:tr>
@@ -775,13 +756,13 @@
                           <pic:cNvPicPr/>
                         </pic:nvPicPr>
                         <pic:blipFill>
-                          <a:blip r:embed="rId10" cstate="print">
+                          <a:blip r:embed="rId11" cstate="print">
                             <a:extLst>
                               <a:ext uri="{28A0092B-C50C-407E-A947-70E740481C1C}">
                                 <a14:useLocalDpi xmlns:a14="http://schemas.microsoft.com/office/drawing/2010/main" val="0"/>
                               </a:ext>
                               <a:ext uri="{96DAC541-7B7A-43D3-8B79-37D633B846F1}">
-                                <asvg:svgBlip xmlns:asvg="http://schemas.microsoft.com/office/drawing/2016/SVG/main" r:embed="rId11"/>
+                                <asvg:svgBlip xmlns:asvg="http://schemas.microsoft.com/office/drawing/2016/SVG/main" r:embed="rId12"/>
                               </a:ext>
                             </a:extLst>
                           </a:blip>
@@ -873,13 +854,13 @@
                           <pic:cNvPicPr/>
                         </pic:nvPicPr>
                         <pic:blipFill>
-                          <a:blip r:embed="rId12" cstate="print">
+                          <a:blip r:embed="rId13" cstate="print">
                             <a:extLst>
                               <a:ext uri="{28A0092B-C50C-407E-A947-70E740481C1C}">
                                 <a14:useLocalDpi xmlns:a14="http://schemas.microsoft.com/office/drawing/2010/main" val="0"/>
                               </a:ext>
                               <a:ext uri="{96DAC541-7B7A-43D3-8B79-37D633B846F1}">
-                                <asvg:svgBlip xmlns:asvg="http://schemas.microsoft.com/office/drawing/2016/SVG/main" r:embed="rId13"/>
+                                <asvg:svgBlip xmlns:asvg="http://schemas.microsoft.com/office/drawing/2016/SVG/main" r:embed="rId14"/>
                               </a:ext>
                             </a:extLst>
                           </a:blip>
@@ -974,13 +955,13 @@
                           <pic:cNvPicPr/>
                         </pic:nvPicPr>
                         <pic:blipFill>
-                          <a:blip r:embed="rId14" cstate="print">
+                          <a:blip r:embed="rId15" cstate="print">
                             <a:extLst>
                               <a:ext uri="{28A0092B-C50C-407E-A947-70E740481C1C}">
                                 <a14:useLocalDpi xmlns:a14="http://schemas.microsoft.com/office/drawing/2010/main" val="0"/>
                               </a:ext>
                               <a:ext uri="{96DAC541-7B7A-43D3-8B79-37D633B846F1}">
-                                <asvg:svgBlip xmlns:asvg="http://schemas.microsoft.com/office/drawing/2016/SVG/main" r:embed="rId15"/>
+                                <asvg:svgBlip xmlns:asvg="http://schemas.microsoft.com/office/drawing/2016/SVG/main" r:embed="rId16"/>
                               </a:ext>
                             </a:extLst>
                           </a:blip>
@@ -1072,13 +1053,13 @@
                           <pic:cNvPicPr/>
                         </pic:nvPicPr>
                         <pic:blipFill>
-                          <a:blip r:embed="rId16" cstate="print">
+                          <a:blip r:embed="rId17" cstate="print">
                             <a:extLst>
                               <a:ext uri="{28A0092B-C50C-407E-A947-70E740481C1C}">
                                 <a14:useLocalDpi xmlns:a14="http://schemas.microsoft.com/office/drawing/2010/main" val="0"/>
                               </a:ext>
                               <a:ext uri="{96DAC541-7B7A-43D3-8B79-37D633B846F1}">
-                                <asvg:svgBlip xmlns:asvg="http://schemas.microsoft.com/office/drawing/2016/SVG/main" r:embed="rId17"/>
+                                <asvg:svgBlip xmlns:asvg="http://schemas.microsoft.com/office/drawing/2016/SVG/main" r:embed="rId18"/>
                               </a:ext>
                             </a:extLst>
                           </a:blip>
@@ -1574,12 +1555,12 @@
     </w:tbl>
     <w:p/>
     <w:sectPr>
-      <w:headerReference w:type="even" r:id="rId18"/>
-      <w:headerReference w:type="default" r:id="rId19"/>
-      <w:footerReference w:type="even" r:id="rId20"/>
-      <w:footerReference w:type="default" r:id="rId21"/>
-      <w:headerReference w:type="first" r:id="rId22"/>
-      <w:footerReference w:type="first" r:id="rId23"/>
+      <w:headerReference w:type="even" r:id="rId19"/>
+      <w:headerReference w:type="default" r:id="rId20"/>
+      <w:footerReference w:type="even" r:id="rId21"/>
+      <w:footerReference w:type="default" r:id="rId22"/>
+      <w:headerReference w:type="first" r:id="rId23"/>
+      <w:footerReference w:type="first" r:id="rId24"/>
       <w:pgSz w:w="12240" w:h="15840" w:code="1"/>
       <w:pgMar w:top="720" w:right="1134" w:bottom="0" w:left="1418" w:header="0" w:footer="0" w:gutter="0"/>
       <w:cols w:space="708"/>
@@ -3078,32 +3059,6 @@
   <w:docParts>
     <w:docPart>
       <w:docPartPr>
-        <w:name w:val="B80428F3CBB84FF2831AB0FC3EB924F9"/>
-        <w:category>
-          <w:name w:val="General"/>
-          <w:gallery w:val="placeholder"/>
-        </w:category>
-        <w:types>
-          <w:type w:val="bbPlcHdr"/>
-        </w:types>
-        <w:behaviors>
-          <w:behavior w:val="content"/>
-        </w:behaviors>
-        <w:guid w:val="{D3774C7C-F16A-4EDF-8FC8-8A19A09E7A6B}"/>
-      </w:docPartPr>
-      <w:docPartBody>
-        <w:p>
-          <w:pPr>
-            <w:pStyle w:val="B80428F3CBB84FF2831AB0FC3EB924F9"/>
-          </w:pPr>
-          <w:r>
-            <w:t>Developer</w:t>
-          </w:r>
-        </w:p>
-      </w:docPartBody>
-    </w:docPart>
-    <w:docPart>
-      <w:docPartPr>
         <w:name w:val="E80DB9745E954010A69BE336A7EA059C"/>
         <w:category>
           <w:name w:val="General"/>
@@ -3339,10 +3294,10 @@
   </w:font>
   <w:font w:name="Wingdings">
     <w:panose1 w:val="05000000000000000000"/>
-    <w:charset w:val="02"/>
-    <w:family w:val="auto"/>
+    <w:charset w:val="4D"/>
+    <w:family w:val="decorative"/>
     <w:pitch w:val="variable"/>
-    <w:sig w:usb0="00000000" w:usb1="10000000" w:usb2="00000000" w:usb3="00000000" w:csb0="80000000" w:csb1="00000000"/>
+    <w:sig w:usb0="00000003" w:usb1="00000000" w:usb2="00000000" w:usb3="00000000" w:csb0="80000001" w:csb1="00000000"/>
   </w:font>
   <w:font w:name="Arial">
     <w:panose1 w:val="020B0604020202020204"/>
@@ -3362,9 +3317,9 @@
     <w:altName w:val="돋움"/>
     <w:panose1 w:val="020B0600000101010101"/>
     <w:charset w:val="81"/>
-    <w:family w:val="modern"/>
-    <w:pitch w:val="fixed"/>
-    <w:sig w:usb0="00000001" w:usb1="09060000" w:usb2="00000010" w:usb3="00000000" w:csb0="00080000" w:csb1="00000000"/>
+    <w:family w:val="swiss"/>
+    <w:pitch w:val="variable"/>
+    <w:sig w:usb0="B00002AF" w:usb1="69D77CFB" w:usb2="00000030" w:usb3="00000000" w:csb0="0008009F" w:csb1="00000000"/>
   </w:font>
   <w:font w:name="Segoe UI">
     <w:panose1 w:val="020B0502040204020203"/>
@@ -3377,9 +3332,9 @@
     <w:altName w:val="바탕"/>
     <w:panose1 w:val="02030600000101010101"/>
     <w:charset w:val="81"/>
-    <w:family w:val="auto"/>
-    <w:pitch w:val="fixed"/>
-    <w:sig w:usb0="00000001" w:usb1="09060000" w:usb2="00000010" w:usb3="00000000" w:csb0="00080000" w:csb1="00000000"/>
+    <w:family w:val="roman"/>
+    <w:pitch w:val="variable"/>
+    <w:sig w:usb0="B00002AF" w:usb1="69D77CFB" w:usb2="00000030" w:usb3="00000000" w:csb0="0008009F" w:csb1="00000000"/>
   </w:font>
   <w:font w:name="Aptos">
     <w:panose1 w:val="020B0004020202020204"/>
@@ -3935,6 +3890,7 @@
     <w:rsid w:val="00E51970"/>
     <w:rsid w:val="00E70543"/>
     <w:rsid w:val="00E714D8"/>
+    <w:rsid w:val="00FE0109"/>
   </w:rsids>
   <m:mathPr>
     <m:mathFont m:val="Cambria Math"/>
@@ -4659,24 +4615,6 @@
       <w:lang w:val="en-AU" w:eastAsia="en-AU"/>
     </w:rPr>
   </w:style>
-  <w:style w:type="paragraph" w:customStyle="1" w:styleId="33044AD48E4E41E1A21E01E512E7FA723">
-    <w:name w:val="33044AD48E4E41E1A21E01E512E7FA723"/>
-    <w:rsid w:val="00CE0AB1"/>
-    <w:pPr>
-      <w:tabs>
-        <w:tab w:val="num" w:pos="720"/>
-      </w:tabs>
-      <w:spacing w:after="0" w:line="400" w:lineRule="exact"/>
-      <w:ind w:left="288" w:hanging="288"/>
-      <w:contextualSpacing/>
-    </w:pPr>
-    <w:rPr>
-      <w:rFonts w:eastAsiaTheme="minorHAnsi"/>
-      <w:color w:val="156082" w:themeColor="accent1"/>
-      <w:sz w:val="28"/>
-      <w:szCs w:val="18"/>
-    </w:rPr>
-  </w:style>
   <w:style w:type="paragraph" w:customStyle="1" w:styleId="766AE9B9C6074F5DB15B82178F899F573">
     <w:name w:val="766AE9B9C6074F5DB15B82178F899F573"/>
     <w:rsid w:val="00CE0AB1"/>
@@ -4925,12 +4863,23 @@
 </file>
 
 <file path=customXml/item1.xml><?xml version="1.0" encoding="utf-8"?>
-<?mso-contentType ?>
-<FormTemplates xmlns="http://schemas.microsoft.com/sharepoint/v3/contenttype/forms">
-  <Display>DocumentLibraryForm</Display>
-  <Edit>DocumentLibraryForm</Edit>
-  <New>DocumentLibraryForm</New>
-</FormTemplates>
+<p:properties xmlns:p="http://schemas.microsoft.com/office/2006/metadata/properties" xmlns:xsi="http://www.w3.org/2001/XMLSchema-instance" xmlns:pc="http://schemas.microsoft.com/office/infopath/2007/PartnerControls">
+  <documentManagement>
+    <_ip_UnifiedCompliancePolicyUIAction xmlns="http://schemas.microsoft.com/sharepoint/v3" xsi:nil="true"/>
+    <Image xmlns="71af3243-3dd4-4a8d-8c0d-dd76da1f02a5">
+      <Url xsi:nil="true"/>
+      <Description xsi:nil="true"/>
+    </Image>
+    <Status xmlns="71af3243-3dd4-4a8d-8c0d-dd76da1f02a5">Not started</Status>
+    <Background xmlns="71af3243-3dd4-4a8d-8c0d-dd76da1f02a5">false</Background>
+    <_ip_UnifiedCompliancePolicyProperties xmlns="http://schemas.microsoft.com/sharepoint/v3" xsi:nil="true"/>
+    <ImageTagsTaxHTField xmlns="71af3243-3dd4-4a8d-8c0d-dd76da1f02a5">
+      <Terms xmlns="http://schemas.microsoft.com/office/infopath/2007/PartnerControls"/>
+    </ImageTagsTaxHTField>
+    <TaxCatchAll xmlns="230e9df3-be65-4c73-a93b-d1236ebd677e" xsi:nil="true"/>
+    <MediaServiceKeyPoints xmlns="71af3243-3dd4-4a8d-8c0d-dd76da1f02a5" xsi:nil="true"/>
+  </documentManagement>
+</p:properties>
 </file>
 
 <file path=customXml/item2.xml><?xml version="1.0" encoding="utf-8"?>
@@ -5246,29 +5195,26 @@
 </file>
 
 <file path=customXml/item3.xml><?xml version="1.0" encoding="utf-8"?>
-<p:properties xmlns:p="http://schemas.microsoft.com/office/2006/metadata/properties" xmlns:xsi="http://www.w3.org/2001/XMLSchema-instance" xmlns:pc="http://schemas.microsoft.com/office/infopath/2007/PartnerControls">
-  <documentManagement>
-    <_ip_UnifiedCompliancePolicyUIAction xmlns="http://schemas.microsoft.com/sharepoint/v3" xsi:nil="true"/>
-    <Image xmlns="71af3243-3dd4-4a8d-8c0d-dd76da1f02a5">
-      <Url xsi:nil="true"/>
-      <Description xsi:nil="true"/>
-    </Image>
-    <Status xmlns="71af3243-3dd4-4a8d-8c0d-dd76da1f02a5">Not started</Status>
-    <Background xmlns="71af3243-3dd4-4a8d-8c0d-dd76da1f02a5">false</Background>
-    <_ip_UnifiedCompliancePolicyProperties xmlns="http://schemas.microsoft.com/sharepoint/v3" xsi:nil="true"/>
-    <ImageTagsTaxHTField xmlns="71af3243-3dd4-4a8d-8c0d-dd76da1f02a5">
-      <Terms xmlns="http://schemas.microsoft.com/office/infopath/2007/PartnerControls"/>
-    </ImageTagsTaxHTField>
-    <TaxCatchAll xmlns="230e9df3-be65-4c73-a93b-d1236ebd677e" xsi:nil="true"/>
-    <MediaServiceKeyPoints xmlns="71af3243-3dd4-4a8d-8c0d-dd76da1f02a5" xsi:nil="true"/>
-  </documentManagement>
-</p:properties>
+<?mso-contentType ?>
+<FormTemplates xmlns="http://schemas.microsoft.com/sharepoint/v3/contenttype/forms">
+  <Display>DocumentLibraryForm</Display>
+  <Edit>DocumentLibraryForm</Edit>
+  <New>DocumentLibraryForm</New>
+</FormTemplates>
+</file>
+
+<file path=customXml/item4.xml><?xml version="1.0" encoding="utf-8"?>
+<b:Sources xmlns:b="http://schemas.openxmlformats.org/officeDocument/2006/bibliography" xmlns="http://schemas.openxmlformats.org/officeDocument/2006/bibliography" SelectedStyle="/APASixthEditionOfficeOnline.xsl" StyleName="APA" Version="6"/>
 </file>
 
 <file path=customXml/itemProps1.xml><?xml version="1.0" encoding="utf-8"?>
-<ds:datastoreItem xmlns:ds="http://schemas.openxmlformats.org/officeDocument/2006/customXml" ds:itemID="{C1B41FED-383C-4E81-A1BE-0F43D47BBA7D}">
+<ds:datastoreItem xmlns:ds="http://schemas.openxmlformats.org/officeDocument/2006/customXml" ds:itemID="{A52C9B95-23A4-4407-B754-EE703FEF6257}">
   <ds:schemaRefs>
-    <ds:schemaRef ds:uri="http://schemas.microsoft.com/sharepoint/v3/contenttype/forms"/>
+    <ds:schemaRef ds:uri="http://schemas.microsoft.com/office/2006/metadata/properties"/>
+    <ds:schemaRef ds:uri="http://schemas.microsoft.com/office/infopath/2007/PartnerControls"/>
+    <ds:schemaRef ds:uri="http://schemas.microsoft.com/sharepoint/v3"/>
+    <ds:schemaRef ds:uri="71af3243-3dd4-4a8d-8c0d-dd76da1f02a5"/>
+    <ds:schemaRef ds:uri="230e9df3-be65-4c73-a93b-d1236ebd677e"/>
   </ds:schemaRefs>
 </ds:datastoreItem>
 </file>
@@ -5295,13 +5241,17 @@
 </file>
 
 <file path=customXml/itemProps3.xml><?xml version="1.0" encoding="utf-8"?>
-<ds:datastoreItem xmlns:ds="http://schemas.openxmlformats.org/officeDocument/2006/customXml" ds:itemID="{A52C9B95-23A4-4407-B754-EE703FEF6257}">
+<ds:datastoreItem xmlns:ds="http://schemas.openxmlformats.org/officeDocument/2006/customXml" ds:itemID="{C1B41FED-383C-4E81-A1BE-0F43D47BBA7D}">
   <ds:schemaRefs>
-    <ds:schemaRef ds:uri="http://schemas.microsoft.com/office/2006/metadata/properties"/>
-    <ds:schemaRef ds:uri="http://schemas.microsoft.com/office/infopath/2007/PartnerControls"/>
-    <ds:schemaRef ds:uri="http://schemas.microsoft.com/sharepoint/v3"/>
-    <ds:schemaRef ds:uri="71af3243-3dd4-4a8d-8c0d-dd76da1f02a5"/>
-    <ds:schemaRef ds:uri="230e9df3-be65-4c73-a93b-d1236ebd677e"/>
+    <ds:schemaRef ds:uri="http://schemas.microsoft.com/sharepoint/v3/contenttype/forms"/>
+  </ds:schemaRefs>
+</ds:datastoreItem>
+</file>
+
+<file path=customXml/itemProps4.xml><?xml version="1.0" encoding="utf-8"?>
+<ds:datastoreItem xmlns:ds="http://schemas.openxmlformats.org/officeDocument/2006/customXml" ds:itemID="{80C2CD13-EBD4-6E41-8AB4-AC87A90F8986}">
+  <ds:schemaRefs>
+    <ds:schemaRef ds:uri="http://schemas.openxmlformats.org/officeDocument/2006/bibliography"/>
   </ds:schemaRefs>
 </ds:datastoreItem>
 </file>

</xml_diff>

<commit_message>
updated resume, deleted carson-wu.md
</commit_message>
<xml_diff>
--- a/dev1virtuoso/Attachment/dev1virtuoso/resume/V2/Color block resume.docx
+++ b/dev1virtuoso/Attachment/dev1virtuoso/resume/V2/Color block resume.docx
@@ -564,7 +564,10 @@
               <w:pStyle w:val="Heading4"/>
             </w:pPr>
             <w:r>
-              <w:t>Software Engineer</w:t>
+              <w:t xml:space="preserve">Software </w:t>
+            </w:r>
+            <w:r>
+              <w:t>Devloper</w:t>
             </w:r>
           </w:p>
         </w:tc>
@@ -3873,8 +3876,10 @@
     <w:rsid w:val="005A370A"/>
     <w:rsid w:val="005C1634"/>
     <w:rsid w:val="0075271D"/>
+    <w:rsid w:val="00895913"/>
     <w:rsid w:val="008C079C"/>
     <w:rsid w:val="008C4B09"/>
+    <w:rsid w:val="008C4CA6"/>
     <w:rsid w:val="009A001F"/>
     <w:rsid w:val="009C7087"/>
     <w:rsid w:val="009D769E"/>
@@ -4580,13 +4585,6 @@
       <w:szCs w:val="24"/>
     </w:rPr>
   </w:style>
-  <w:style w:type="paragraph" w:customStyle="1" w:styleId="B80428F3CBB84FF2831AB0FC3EB924F9">
-    <w:name w:val="B80428F3CBB84FF2831AB0FC3EB924F9"/>
-    <w:rsid w:val="005C1634"/>
-    <w:rPr>
-      <w:lang w:val="en-AU" w:eastAsia="en-AU"/>
-    </w:rPr>
-  </w:style>
   <w:style w:type="paragraph" w:customStyle="1" w:styleId="E80DB9745E954010A69BE336A7EA059C">
     <w:name w:val="E80DB9745E954010A69BE336A7EA059C"/>
     <w:rsid w:val="005C1634"/>
@@ -4863,26 +4861,6 @@
 </file>
 
 <file path=customXml/item1.xml><?xml version="1.0" encoding="utf-8"?>
-<p:properties xmlns:p="http://schemas.microsoft.com/office/2006/metadata/properties" xmlns:xsi="http://www.w3.org/2001/XMLSchema-instance" xmlns:pc="http://schemas.microsoft.com/office/infopath/2007/PartnerControls">
-  <documentManagement>
-    <_ip_UnifiedCompliancePolicyUIAction xmlns="http://schemas.microsoft.com/sharepoint/v3" xsi:nil="true"/>
-    <Image xmlns="71af3243-3dd4-4a8d-8c0d-dd76da1f02a5">
-      <Url xsi:nil="true"/>
-      <Description xsi:nil="true"/>
-    </Image>
-    <Status xmlns="71af3243-3dd4-4a8d-8c0d-dd76da1f02a5">Not started</Status>
-    <Background xmlns="71af3243-3dd4-4a8d-8c0d-dd76da1f02a5">false</Background>
-    <_ip_UnifiedCompliancePolicyProperties xmlns="http://schemas.microsoft.com/sharepoint/v3" xsi:nil="true"/>
-    <ImageTagsTaxHTField xmlns="71af3243-3dd4-4a8d-8c0d-dd76da1f02a5">
-      <Terms xmlns="http://schemas.microsoft.com/office/infopath/2007/PartnerControls"/>
-    </ImageTagsTaxHTField>
-    <TaxCatchAll xmlns="230e9df3-be65-4c73-a93b-d1236ebd677e" xsi:nil="true"/>
-    <MediaServiceKeyPoints xmlns="71af3243-3dd4-4a8d-8c0d-dd76da1f02a5" xsi:nil="true"/>
-  </documentManagement>
-</p:properties>
-</file>
-
-<file path=customXml/item2.xml><?xml version="1.0" encoding="utf-8"?>
 <ct:contentTypeSchema xmlns:ct="http://schemas.microsoft.com/office/2006/metadata/contentType" xmlns:ma="http://schemas.microsoft.com/office/2006/metadata/properties/metaAttributes" ct:_="" ma:_="" ma:contentTypeName="Document" ma:contentTypeID="0x01010079F111ED35F8CC479449609E8A0923A6" ma:contentTypeVersion="28" ma:contentTypeDescription="Create a new document." ma:contentTypeScope="" ma:versionID="60f5a4f2d2b0abadcf532d48ebf9cb71">
   <xsd:schema xmlns:xsd="http://www.w3.org/2001/XMLSchema" xmlns:xs="http://www.w3.org/2001/XMLSchema" xmlns:p="http://schemas.microsoft.com/office/2006/metadata/properties" xmlns:ns1="http://schemas.microsoft.com/sharepoint/v3" xmlns:ns2="71af3243-3dd4-4a8d-8c0d-dd76da1f02a5" xmlns:ns3="16c05727-aa75-4e4a-9b5f-8a80a1165891" xmlns:ns4="230e9df3-be65-4c73-a93b-d1236ebd677e" targetNamespace="http://schemas.microsoft.com/office/2006/metadata/properties" ma:root="true" ma:fieldsID="7dd78129e6a1811f84807ad11c651531" ns1:_="" ns2:_="" ns3:_="" ns4:_="">
     <xsd:import namespace="http://schemas.microsoft.com/sharepoint/v3"/>
@@ -5194,7 +5172,31 @@
 </ct:contentTypeSchema>
 </file>
 
+<file path=customXml/item2.xml><?xml version="1.0" encoding="utf-8"?>
+<p:properties xmlns:p="http://schemas.microsoft.com/office/2006/metadata/properties" xmlns:xsi="http://www.w3.org/2001/XMLSchema-instance" xmlns:pc="http://schemas.microsoft.com/office/infopath/2007/PartnerControls">
+  <documentManagement>
+    <_ip_UnifiedCompliancePolicyUIAction xmlns="http://schemas.microsoft.com/sharepoint/v3" xsi:nil="true"/>
+    <Image xmlns="71af3243-3dd4-4a8d-8c0d-dd76da1f02a5">
+      <Url xsi:nil="true"/>
+      <Description xsi:nil="true"/>
+    </Image>
+    <Status xmlns="71af3243-3dd4-4a8d-8c0d-dd76da1f02a5">Not started</Status>
+    <Background xmlns="71af3243-3dd4-4a8d-8c0d-dd76da1f02a5">false</Background>
+    <_ip_UnifiedCompliancePolicyProperties xmlns="http://schemas.microsoft.com/sharepoint/v3" xsi:nil="true"/>
+    <ImageTagsTaxHTField xmlns="71af3243-3dd4-4a8d-8c0d-dd76da1f02a5">
+      <Terms xmlns="http://schemas.microsoft.com/office/infopath/2007/PartnerControls"/>
+    </ImageTagsTaxHTField>
+    <TaxCatchAll xmlns="230e9df3-be65-4c73-a93b-d1236ebd677e" xsi:nil="true"/>
+    <MediaServiceKeyPoints xmlns="71af3243-3dd4-4a8d-8c0d-dd76da1f02a5" xsi:nil="true"/>
+  </documentManagement>
+</p:properties>
+</file>
+
 <file path=customXml/item3.xml><?xml version="1.0" encoding="utf-8"?>
+<b:Sources xmlns:b="http://schemas.openxmlformats.org/officeDocument/2006/bibliography" xmlns="http://schemas.openxmlformats.org/officeDocument/2006/bibliography" SelectedStyle="/APASixthEditionOfficeOnline.xsl" StyleName="APA" Version="6"/>
+</file>
+
+<file path=customXml/item4.xml><?xml version="1.0" encoding="utf-8"?>
 <?mso-contentType ?>
 <FormTemplates xmlns="http://schemas.microsoft.com/sharepoint/v3/contenttype/forms">
   <Display>DocumentLibraryForm</Display>
@@ -5203,23 +5205,7 @@
 </FormTemplates>
 </file>
 
-<file path=customXml/item4.xml><?xml version="1.0" encoding="utf-8"?>
-<b:Sources xmlns:b="http://schemas.openxmlformats.org/officeDocument/2006/bibliography" xmlns="http://schemas.openxmlformats.org/officeDocument/2006/bibliography" SelectedStyle="/APASixthEditionOfficeOnline.xsl" StyleName="APA" Version="6"/>
-</file>
-
 <file path=customXml/itemProps1.xml><?xml version="1.0" encoding="utf-8"?>
-<ds:datastoreItem xmlns:ds="http://schemas.openxmlformats.org/officeDocument/2006/customXml" ds:itemID="{A52C9B95-23A4-4407-B754-EE703FEF6257}">
-  <ds:schemaRefs>
-    <ds:schemaRef ds:uri="http://schemas.microsoft.com/office/2006/metadata/properties"/>
-    <ds:schemaRef ds:uri="http://schemas.microsoft.com/office/infopath/2007/PartnerControls"/>
-    <ds:schemaRef ds:uri="http://schemas.microsoft.com/sharepoint/v3"/>
-    <ds:schemaRef ds:uri="71af3243-3dd4-4a8d-8c0d-dd76da1f02a5"/>
-    <ds:schemaRef ds:uri="230e9df3-be65-4c73-a93b-d1236ebd677e"/>
-  </ds:schemaRefs>
-</ds:datastoreItem>
-</file>
-
-<file path=customXml/itemProps2.xml><?xml version="1.0" encoding="utf-8"?>
 <ds:datastoreItem xmlns:ds="http://schemas.openxmlformats.org/officeDocument/2006/customXml" ds:itemID="{724D3FBC-5C5B-4ECC-A8E7-1F8E4AE75F11}">
   <ds:schemaRefs>
     <ds:schemaRef ds:uri="http://schemas.microsoft.com/office/2006/metadata/contentType"/>
@@ -5240,7 +5226,27 @@
 </ds:datastoreItem>
 </file>
 
+<file path=customXml/itemProps2.xml><?xml version="1.0" encoding="utf-8"?>
+<ds:datastoreItem xmlns:ds="http://schemas.openxmlformats.org/officeDocument/2006/customXml" ds:itemID="{A52C9B95-23A4-4407-B754-EE703FEF6257}">
+  <ds:schemaRefs>
+    <ds:schemaRef ds:uri="http://schemas.microsoft.com/office/2006/metadata/properties"/>
+    <ds:schemaRef ds:uri="http://schemas.microsoft.com/office/infopath/2007/PartnerControls"/>
+    <ds:schemaRef ds:uri="http://schemas.microsoft.com/sharepoint/v3"/>
+    <ds:schemaRef ds:uri="71af3243-3dd4-4a8d-8c0d-dd76da1f02a5"/>
+    <ds:schemaRef ds:uri="230e9df3-be65-4c73-a93b-d1236ebd677e"/>
+  </ds:schemaRefs>
+</ds:datastoreItem>
+</file>
+
 <file path=customXml/itemProps3.xml><?xml version="1.0" encoding="utf-8"?>
+<ds:datastoreItem xmlns:ds="http://schemas.openxmlformats.org/officeDocument/2006/customXml" ds:itemID="{80C2CD13-EBD4-6E41-8AB4-AC87A90F8986}">
+  <ds:schemaRefs>
+    <ds:schemaRef ds:uri="http://schemas.openxmlformats.org/officeDocument/2006/bibliography"/>
+  </ds:schemaRefs>
+</ds:datastoreItem>
+</file>
+
+<file path=customXml/itemProps4.xml><?xml version="1.0" encoding="utf-8"?>
 <ds:datastoreItem xmlns:ds="http://schemas.openxmlformats.org/officeDocument/2006/customXml" ds:itemID="{C1B41FED-383C-4E81-A1BE-0F43D47BBA7D}">
   <ds:schemaRefs>
     <ds:schemaRef ds:uri="http://schemas.microsoft.com/sharepoint/v3/contenttype/forms"/>
@@ -5248,14 +5254,6 @@
 </ds:datastoreItem>
 </file>
 
-<file path=customXml/itemProps4.xml><?xml version="1.0" encoding="utf-8"?>
-<ds:datastoreItem xmlns:ds="http://schemas.openxmlformats.org/officeDocument/2006/customXml" ds:itemID="{80C2CD13-EBD4-6E41-8AB4-AC87A90F8986}">
-  <ds:schemaRefs>
-    <ds:schemaRef ds:uri="http://schemas.openxmlformats.org/officeDocument/2006/bibliography"/>
-  </ds:schemaRefs>
-</ds:datastoreItem>
-</file>
-
 <file path=docMetadata/LabelInfo.xml><?xml version="1.0" encoding="utf-8"?>
 <clbl:labelList xmlns:clbl="http://schemas.microsoft.com/office/2020/mipLabelMetadata"/>
 </file>
</xml_diff>